<commit_message>
Direct send + bulk day editor + planner economics + validated checks (ported)
Co-Authored-By: Claude Fable 5 <noreply@anthropic.com>
</commit_message>
<xml_diff>
--- a/docs/Work_Management_Manual.docx
+++ b/docs/Work_Management_Manual.docx
@@ -209,7 +209,7 @@
     </w:p>
     <w:p>
       <w:r>
-        <w:t>The payment section is worker-centric. Each worker's confirmed earnings are reviewed, sent to accounts as their own payment entry, and released. The status ladder per worker is: Unpaid → Reviewed → Sent to accounts → Paid.</w:t>
+        <w:t>The payment section is worker-centric. Each worker's confirmed earnings are sent to accounts as their own payment entry and released. The status ladder per worker is: Unpaid → Sent to accounts → Paid. There is no separate review step — sending IS the sign-off: the sender's name and time are stamped on every included day-row and on the payment entry. The review sheet stays available for checking anyone before sending.</w:t>
       </w:r>
     </w:p>
     <w:p>
@@ -244,7 +244,7 @@
         <w:pStyle w:val="ListBullet"/>
       </w:pPr>
       <w:r>
-        <w:t>Every day row shows presence evidence next to the pay. Unpaid days can be corrected with Edit — pay recomputes at the row's rate, the parent re-sums, an audit comment records the change, and the worker returns to Unpaid for re-review.</w:t>
+        <w:t>Every day row shows presence evidence next to the pay. In Work &amp; days, every unpaid day's quantity is directly editable — change as many as needed and press the single Save changes button at the bottom (Undo restores the originals). Pay recomputes at each row's rate, documents re-sum, and one audit comment per document lists every change.</w:t>
       </w:r>
     </w:p>
     <w:p>
@@ -271,7 +271,7 @@
         <w:pStyle w:val="ListBullet"/>
       </w:pPr>
       <w:r>
-        <w:t>Review &amp; approve stamps the worker's unpaid rows as Reviewed (who + when — the stamps live on the day rows and travel onto the payment entry).</w:t>
+        <w:t>Submit &amp; send to accounts creates one payment document for that worker (WMPAY-…) holding the period, totals, who sent it and when, and one line per actuals document with the task, block, worked period, days, qty, rate, amount and the whole sign-off chain. The sender is stamped as reviewer on every included day-row.</w:t>
       </w:r>
     </w:p>
     <w:p>
@@ -279,15 +279,7 @@
         <w:pStyle w:val="ListBullet"/>
       </w:pPr>
       <w:r>
-        <w:t>Send to accounts creates one payment document for that worker (WMPAY-…) holding the period, totals, reviewer, and one line per actuals document with the task, block, worked period, days, qty, rate, amount and the whole sign-off chain.</w:t>
-      </w:r>
-    </w:p>
-    <w:p>
-      <w:pPr>
-        <w:pStyle w:val="ListBullet"/>
-      </w:pPr>
-      <w:r>
-        <w:t>Bulk: tick several workers (workers with attendance conflicts carry a red flag with the day count) and use Review &amp; send to accounts — each still gets their own entry.</w:t>
+        <w:t>Bulk: tick several workers (workers with attendance conflicts carry a red flag with the day count) and use Send to accounts — each still gets their own entry.</w:t>
       </w:r>
     </w:p>
     <w:p>
@@ -386,7 +378,7 @@
         <w:pStyle w:val="ListBullet"/>
       </w:pPr>
       <w:r>
-        <w:t>Paid on marked-Absent days — a scan time means the attendance record is probably wrong; no scan means the entry needs scrutiny.</w:t>
+        <w:t>Paid on marked-Absent days — a scan time means the attendance record is probably wrong; no scan means the entry needs scrutiny. Days whose attendance was corrected (a Present record exists alongside an old Absent one) are validated out and never flagged.</w:t>
       </w:r>
     </w:p>
     <w:p>
@@ -541,7 +533,7 @@
         <w:pStyle w:val="ListBullet"/>
       </w:pPr>
       <w:r>
-        <w:t>Pipeline performers — every plan creator, assigner, actuals enterer and approver ranked by volume and value.</w:t>
+        <w:t>Pipeline performers — planner and assigner economics, per person: plans created, target vs actual quantity (achievement %), planned budget vs money spent, and cost per unit, with most/least-expensive callouts (judged only on people with real volume). The Assigners tab shows assignments made, workers put on jobs, output and spend on their assignments.</w:t>
       </w:r>
     </w:p>
     <w:p>

</xml_diff>

<commit_message>
Remove Operations control section (ported)
Co-Authored-By: Claude Fable 5 <noreply@anthropic.com>
</commit_message>
<xml_diff>
--- a/docs/Work_Management_Manual.docx
+++ b/docs/Work_Management_Manual.docx
@@ -517,14 +517,6 @@
         <w:pStyle w:val="ListBullet"/>
       </w:pPr>
       <w:r>
-        <w:t>Approver KPIs — per approval stage: each approver's sign-offs, value and time taken.</w:t>
-      </w:r>
-    </w:p>
-    <w:p>
-      <w:pPr>
-        <w:pStyle w:val="ListBullet"/>
-      </w:pPr>
-      <w:r>
         <w:t>Value flow — weekly planned/assigned/confirmed value and a per-plan table with each plan's accountability chain.</w:t>
       </w:r>
     </w:p>

</xml_diff>

<commit_message>
Consultant weekly review: gate, week board API, planner tab, doctype fields
- api/planner.py: consultant gate in approve; week_board/week_approve/week_return
- www/work-planner.html/.js: Weekly review tab and board
- Work Management Settings: require_consultant_approval, consultant_users
- Work Management Planner: custom_consultant_state/by/at/note
- docs: manual updated

Co-Authored-By: Claude Fable 5 <noreply@anthropic.com>
</commit_message>
<xml_diff>
--- a/docs/Work_Management_Manual.docx
+++ b/docs/Work_Management_Manual.docx
@@ -92,6 +92,67 @@
       </w:pPr>
       <w:r>
         <w:t>Approved plans become available to the Assigner. A plan's budget = rate × target quantity.</w:t>
+      </w:r>
+    </w:p>
+    <w:p>
+      <w:pPr>
+        <w:pStyle w:val="Heading2"/>
+      </w:pPr>
+      <w:r>
+        <w:rPr>
+          <w:color w:val="0A0A0A"/>
+        </w:rPr>
+        <w:t>Consultant weekly review (Weekly review tab)</w:t>
+      </w:r>
+    </w:p>
+    <w:p>
+      <w:r>
+        <w:t>Plans that start in an upcoming week must be signed off by a consultant before the Farm Manager can approve them individually. Plans for the current week are exempt, so day-to-day operations are never blocked.</w:t>
+      </w:r>
+    </w:p>
+    <w:p>
+      <w:pPr>
+        <w:pStyle w:val="ListNumber"/>
+      </w:pPr>
+      <w:r>
+        <w:t>Open the Weekly review tab on /work-planner, pick the farm and the week (it defaults to next Monday; use Prev/Next week to move).</w:t>
+      </w:r>
+    </w:p>
+    <w:p>
+      <w:pPr>
+        <w:pStyle w:val="ListNumber"/>
+      </w:pPr>
+      <w:r>
+        <w:t>The board shows the whole week as one package: number of plans, total budgeted value (rate × target across every plan), peak crew per day against the farm's active workforce, and a day-by-day crew-load chart. If any day asks for more workers than the farm has, the board flags the week as over-planned.</w:t>
+      </w:r>
+    </w:p>
+    <w:p>
+      <w:pPr>
+        <w:pStyle w:val="ListNumber"/>
+      </w:pPr>
+      <w:r>
+        <w:t>Below the chart, every plan is listed with its task, blocks, period, crew per day, target, rate, budget, who requested it, and its consultant status.</w:t>
+      </w:r>
+    </w:p>
+    <w:p>
+      <w:pPr>
+        <w:pStyle w:val="ListNumber"/>
+      </w:pPr>
+      <w:r>
+        <w:t>Consultants decide the week in one action: 'Approve week' stamps every plan as consultant-approved and unlocks Farm Manager approval; 'Return with note' sends the whole week back — the note is required and is written on every plan for the planner to act on.</w:t>
+      </w:r>
+    </w:p>
+    <w:p>
+      <w:pPr>
+        <w:pStyle w:val="ListNumber"/>
+      </w:pPr>
+      <w:r>
+        <w:t>Every decision is stamped on the plans (who, when, note) and logged as a comment, so the trail survives on the document.</w:t>
+      </w:r>
+    </w:p>
+    <w:p>
+      <w:r>
+        <w:t>Who can decide: only the users named in Work Management Settings → Consultant users (comma-separated emails), plus System Managers. Everyone else sees the board read-only. The whole gate can be switched off with the 'Require consultant approval for future-week plans' checkbox in Settings.</w:t>
       </w:r>
     </w:p>
     <w:p>
@@ -684,6 +745,14 @@
     </w:p>
     <w:p>
       <w:pPr>
+        <w:pStyle w:val="ListBullet"/>
+      </w:pPr>
+      <w:r>
+        <w:t>Consultant weekly review: require consultant approval for future-week plans (on by default), consultant users — the comma-separated emails allowed to approve or return a farm's week.</w:t>
+      </w:r>
+    </w:p>
+    <w:p>
+      <w:pPr>
         <w:pStyle w:val="Heading1"/>
       </w:pPr>
       <w:r>

</xml_diff>

<commit_message>
Manual: attendance mechanics detailed in the Assigner section
Co-Authored-By: Claude Fable 5 <noreply@anthropic.com>
</commit_message>
<xml_diff>
--- a/docs/Work_Management_Manual.docx
+++ b/docs/Work_Management_Manual.docx
@@ -204,6 +204,78 @@
       </w:pPr>
       <w:r>
         <w:t>The General Manager signs off assignments. Mid-job changes use the swap button — substitutions record who left, who joined and when.</w:t>
+      </w:r>
+    </w:p>
+    <w:p>
+      <w:pPr>
+        <w:pStyle w:val="Heading2"/>
+      </w:pPr>
+      <w:r>
+        <w:rPr>
+          <w:color w:val="0A0A0A"/>
+        </w:rPr>
+        <w:t>How attendance is checked at assignment</w:t>
+      </w:r>
+    </w:p>
+    <w:p>
+      <w:r>
+        <w:t>Every worker is screened against attendance before they can be given work. Each check is a switch in Work Management Settings (section 10).</w:t>
+      </w:r>
+    </w:p>
+    <w:p>
+      <w:pPr>
+        <w:pStyle w:val="ListBullet"/>
+      </w:pPr>
+      <w:r>
+        <w:t>Marked Absent — a submitted Absent attendance record blocks the worker for that day. A Present, Half Day or WFH record on the same day always wins over a stale Absent one, so corrected attendance clears the flag immediately.</w:t>
+      </w:r>
+    </w:p>
+    <w:p>
+      <w:pPr>
+        <w:pStyle w:val="ListBullet"/>
+      </w:pPr>
+      <w:r>
+        <w:t>Approved leave — leave overlapping the work window flags the worker.</w:t>
+      </w:r>
+    </w:p>
+    <w:p>
+      <w:pPr>
+        <w:pStyle w:val="ListBullet"/>
+      </w:pPr>
+      <w:r>
+        <w:t>Weekly offs and holidays — the off-day rule is configurable: flag only when offs cover the whole window (default), flag any off day in the window, or ignore offs at assignment. Night-shift guards whose off starts the morning after their shift are handled by the same rule.</w:t>
+      </w:r>
+    </w:p>
+    <w:p>
+      <w:pPr>
+        <w:pStyle w:val="ListBullet"/>
+      </w:pPr>
+      <w:r>
+        <w:t>Morning presence — when the window includes today, the worker must have scanned in (or have a Present record) by the cutoff time (default 09:00). Before the cutoff nobody is blocked, so early assigning always works; night shifts are exempt.</w:t>
+      </w:r>
+    </w:p>
+    <w:p>
+      <w:pPr>
+        <w:pStyle w:val="ListBullet"/>
+      </w:pPr>
+      <w:r>
+        <w:t>Assigned elsewhere — a worker already on a live assignment for an overlapping period cannot be picked at all; this one has no override because it creates double pay.</w:t>
+      </w:r>
+    </w:p>
+    <w:p>
+      <w:pPr>
+        <w:pStyle w:val="ListBullet"/>
+      </w:pPr>
+      <w:r>
+        <w:t>Overrides — leave, off-day and no-scan conflicts can be pushed through with an explicit confirmation; the server re-checks on submit and writes every override on the assignment, so the trail is permanent. Recording actuals on a marked-Absent day is stricter: only the Farm Manager or GM can confirm it.</w:t>
+      </w:r>
+    </w:p>
+    <w:p>
+      <w:pPr>
+        <w:pStyle w:val="ListBullet"/>
+      </w:pPr>
+      <w:r>
+        <w:t>Missing attendance never blocks anyone — only an explicit record does, so a device sync gap cannot stop work from being assigned.</w:t>
       </w:r>
     </w:p>
     <w:p>

</xml_diff>

<commit_message>
Assigner: today's presence chip (P / A / ?) on every worker, any window
Co-Authored-By: Claude Fable 5 <noreply@anthropic.com>
</commit_message>
<xml_diff>
--- a/docs/Work_Management_Manual.docx
+++ b/docs/Work_Management_Manual.docx
@@ -179,7 +179,7 @@
         <w:pStyle w:val="ListNumber"/>
       </w:pPr>
       <w:r>
-        <w:t>Every worker carries live badges: presence (P · 06:12 scanned in, 'not in yet', or 'night shift'), off days in the window, leave, absences, and 'assigned elsewhere' (a worker on another live assignment for an overlapping period cannot be picked — this prevents double allocation and double pay).</w:t>
+        <w:t>Every worker carries today's presence chip, whatever the work window: P · 06:12 (scanned in or marked Present), A today (submitted Absent record — a Present record always beats a stale Absent one), ? today (no scan or attendance record yet), or 'night shift'. Alongside it: off days in the window, leave, absences, and 'assigned elsewhere' (a worker on another live assignment for an overlapping period cannot be picked — this prevents double allocation and double pay).</w:t>
       </w:r>
     </w:p>
     <w:p>
@@ -187,7 +187,7 @@
         <w:pStyle w:val="ListNumber"/>
       </w:pPr>
       <w:r>
-        <w:t>When the window includes today, a presence bar shows how many of the farm's workers have scanned in, with a 'only workers who are in' filter and a Refresh scans link.</w:t>
+        <w:t>A presence bar above the picker shows how many of the farm's workers are in today, a key for the chips, an 'only workers who are in' filter and a Refresh scans link. The morning-scan block itself still applies only to day-of assignment.</w:t>
       </w:r>
     </w:p>
     <w:p>

</xml_diff>